<commit_message>
initialized commute path and lane coverage for agents
</commit_message>
<xml_diff>
--- a/Paper_Draft.docx
+++ b/Paper_Draft.docx
@@ -468,7 +468,23 @@
           <w:kern w:val="0"/>
           <w14:ligatures w14:val="none"/>
         </w:rPr>
-        <w:t xml:space="preserve">Each of the 200 agents is initialized with the following attributes: </w:t>
+        <w:t xml:space="preserve">Each of the 200 agents </w:t>
+      </w:r>
+      <w:r>
+        <w:rPr>
+          <w:rFonts w:eastAsia="Times New Roman"/>
+          <w:kern w:val="0"/>
+          <w14:ligatures w14:val="none"/>
+        </w:rPr>
+        <w:t>are</w:t>
+      </w:r>
+      <w:r>
+        <w:rPr>
+          <w:rFonts w:eastAsia="Times New Roman"/>
+          <w:kern w:val="0"/>
+          <w14:ligatures w14:val="none"/>
+        </w:rPr>
+        <w:t xml:space="preserve"> initialized with the following attributes: </w:t>
       </w:r>
     </w:p>
     <w:p>
@@ -561,7 +577,23 @@
           <w:kern w:val="0"/>
           <w14:ligatures w14:val="none"/>
         </w:rPr>
-        <w:t xml:space="preserve"> fixed commute path precomputed via BFS on the grid from home to work and stored as an ordered list of cell coordinates</w:t>
+        <w:t xml:space="preserve"> fixed commute path precomputed via </w:t>
+      </w:r>
+      <w:r>
+        <w:rPr>
+          <w:rFonts w:eastAsia="Times New Roman"/>
+          <w:kern w:val="0"/>
+          <w14:ligatures w14:val="none"/>
+        </w:rPr>
+        <w:t>Manhattan distance</w:t>
+      </w:r>
+      <w:r>
+        <w:rPr>
+          <w:rFonts w:eastAsia="Times New Roman"/>
+          <w:kern w:val="0"/>
+          <w14:ligatures w14:val="none"/>
+        </w:rPr>
+        <w:t xml:space="preserve"> on the grid from home to work and stored as an ordered list of cell coordinates</w:t>
       </w:r>
     </w:p>
     <w:p>
@@ -584,15 +616,7 @@
           <w:kern w:val="0"/>
           <w14:ligatures w14:val="none"/>
         </w:rPr>
-        <w:t>T</w:t>
-      </w:r>
-      <w:r>
-        <w:rPr>
-          <w:rFonts w:eastAsia="Times New Roman"/>
-          <w:kern w:val="0"/>
-          <w14:ligatures w14:val="none"/>
-        </w:rPr>
-        <w:t xml:space="preserve">ravel time constants </w:t>
+        <w:t xml:space="preserve">A fixed </w:t>
       </w:r>
       <w:r>
         <w:rPr>
@@ -602,15 +626,7 @@
           <w:szCs w:val="20"/>
           <w14:ligatures w14:val="none"/>
         </w:rPr>
-        <w:t>time_bike</w:t>
-      </w:r>
-      <w:r>
-        <w:rPr>
-          <w:rFonts w:eastAsia="Times New Roman"/>
-          <w:kern w:val="0"/>
-          <w14:ligatures w14:val="none"/>
-        </w:rPr>
-        <w:t xml:space="preserve"> and </w:t>
+        <w:t>lane_coverage_on_path</w:t>
       </w:r>
       <w:r>
         <w:rPr>
@@ -620,15 +636,15 @@
           <w:szCs w:val="20"/>
           <w14:ligatures w14:val="none"/>
         </w:rPr>
-        <w:t>time_car</w:t>
-      </w:r>
-      <w:r>
-        <w:rPr>
-          <w:rFonts w:eastAsia="Times New Roman"/>
-          <w:kern w:val="0"/>
-          <w14:ligatures w14:val="none"/>
-        </w:rPr>
-        <w:t xml:space="preserve"> derived from path length</w:t>
+        <w:t>,</w:t>
+      </w:r>
+      <w:r>
+        <w:rPr>
+          <w:rFonts w:eastAsia="Times New Roman"/>
+          <w:kern w:val="0"/>
+          <w14:ligatures w14:val="none"/>
+        </w:rPr>
+        <w:t xml:space="preserve"> which takes cells with bike lanes as a fraction of total cells in commute path</w:t>
       </w:r>
     </w:p>
     <w:p>
@@ -651,15 +667,15 @@
           <w:kern w:val="0"/>
           <w14:ligatures w14:val="none"/>
         </w:rPr>
-        <w:t>A</w:t>
-      </w:r>
-      <w:r>
-        <w:rPr>
-          <w:rFonts w:eastAsia="Times New Roman"/>
-          <w:kern w:val="0"/>
-          <w14:ligatures w14:val="none"/>
-        </w:rPr>
-        <w:t xml:space="preserve"> baseline probability of biking </w:t>
+        <w:t>T</w:t>
+      </w:r>
+      <w:r>
+        <w:rPr>
+          <w:rFonts w:eastAsia="Times New Roman"/>
+          <w:kern w:val="0"/>
+          <w14:ligatures w14:val="none"/>
+        </w:rPr>
+        <w:t xml:space="preserve">ravel time constants </w:t>
       </w:r>
       <w:r>
         <w:rPr>
@@ -669,44 +685,16 @@
           <w:szCs w:val="20"/>
           <w14:ligatures w14:val="none"/>
         </w:rPr>
-        <w:t>p_bike</w:t>
-      </w:r>
-      <w:r>
-        <w:rPr>
-          <w:rFonts w:eastAsia="Times New Roman"/>
-          <w:kern w:val="0"/>
-          <w14:ligatures w14:val="none"/>
-        </w:rPr>
-        <w:t xml:space="preserve"> sampled from a uniform distribution over [0, 1]. Agents are placed on their home cell at initialization.</w:t>
-      </w:r>
-    </w:p>
-    <w:p>
-      <w:pPr>
-        <w:spacing w:before="100" w:beforeAutospacing="1" w:after="100" w:afterAutospacing="1"/>
-        <w:rPr>
-          <w:rFonts w:eastAsia="Times New Roman"/>
-          <w:kern w:val="0"/>
-          <w14:ligatures w14:val="none"/>
-        </w:rPr>
-      </w:pPr>
-      <w:r>
-        <w:rPr>
-          <w:rFonts w:eastAsia="Times New Roman"/>
-          <w:kern w:val="0"/>
-          <w14:ligatures w14:val="none"/>
-        </w:rPr>
-        <w:t>Travel times are computed as:</w:t>
-      </w:r>
-    </w:p>
-    <w:p>
-      <w:pPr>
-        <w:spacing w:before="100" w:beforeAutospacing="1" w:after="100" w:afterAutospacing="1"/>
-        <w:rPr>
-          <w:rFonts w:eastAsia="Times New Roman"/>
-          <w:kern w:val="0"/>
-          <w14:ligatures w14:val="none"/>
-        </w:rPr>
-      </w:pPr>
+        <w:t>time_bike</w:t>
+      </w:r>
+      <w:r>
+        <w:rPr>
+          <w:rFonts w:eastAsia="Times New Roman"/>
+          <w:kern w:val="0"/>
+          <w14:ligatures w14:val="none"/>
+        </w:rPr>
+        <w:t xml:space="preserve"> and </w:t>
+      </w:r>
       <w:r>
         <w:rPr>
           <w:rFonts w:ascii="Courier New" w:eastAsia="Times New Roman" w:hAnsi="Courier New" w:cs="Courier New"/>
@@ -715,11 +703,24 @@
           <w:szCs w:val="20"/>
           <w14:ligatures w14:val="none"/>
         </w:rPr>
-        <w:t>time_bike = path_length × bike_speed_constant</w:t>
-      </w:r>
-    </w:p>
-    <w:p>
-      <w:pPr>
+        <w:t>time_car</w:t>
+      </w:r>
+      <w:r>
+        <w:rPr>
+          <w:rFonts w:eastAsia="Times New Roman"/>
+          <w:kern w:val="0"/>
+          <w14:ligatures w14:val="none"/>
+        </w:rPr>
+        <w:t xml:space="preserve"> derived from path length</w:t>
+      </w:r>
+    </w:p>
+    <w:p>
+      <w:pPr>
+        <w:pStyle w:val="ListParagraph"/>
+        <w:numPr>
+          <w:ilvl w:val="0"/>
+          <w:numId w:val="2"/>
+        </w:numPr>
         <w:spacing w:before="100" w:beforeAutospacing="1" w:after="100" w:afterAutospacing="1"/>
         <w:rPr>
           <w:rFonts w:eastAsia="Times New Roman"/>
@@ -727,6 +728,22 @@
           <w14:ligatures w14:val="none"/>
         </w:rPr>
       </w:pPr>
+      <w:r>
+        <w:rPr>
+          <w:rFonts w:eastAsia="Times New Roman"/>
+          <w:kern w:val="0"/>
+          <w14:ligatures w14:val="none"/>
+        </w:rPr>
+        <w:t>A</w:t>
+      </w:r>
+      <w:r>
+        <w:rPr>
+          <w:rFonts w:eastAsia="Times New Roman"/>
+          <w:kern w:val="0"/>
+          <w14:ligatures w14:val="none"/>
+        </w:rPr>
+        <w:t xml:space="preserve"> baseline probability of biking </w:t>
+      </w:r>
       <w:r>
         <w:rPr>
           <w:rFonts w:ascii="Courier New" w:eastAsia="Times New Roman" w:hAnsi="Courier New" w:cs="Courier New"/>
@@ -735,6 +752,89 @@
           <w:szCs w:val="20"/>
           <w14:ligatures w14:val="none"/>
         </w:rPr>
+        <w:t>p_bike</w:t>
+      </w:r>
+      <w:r>
+        <w:rPr>
+          <w:rFonts w:eastAsia="Times New Roman"/>
+          <w:kern w:val="0"/>
+          <w14:ligatures w14:val="none"/>
+        </w:rPr>
+        <w:t xml:space="preserve"> sampled from a uniform distribution over [0, 1]. </w:t>
+      </w:r>
+    </w:p>
+    <w:p>
+      <w:pPr>
+        <w:spacing w:before="100" w:beforeAutospacing="1" w:after="100" w:afterAutospacing="1"/>
+        <w:rPr>
+          <w:rFonts w:eastAsia="Times New Roman"/>
+          <w:kern w:val="0"/>
+          <w14:ligatures w14:val="none"/>
+        </w:rPr>
+      </w:pPr>
+      <w:r>
+        <w:rPr>
+          <w:rFonts w:eastAsia="Times New Roman"/>
+          <w:kern w:val="0"/>
+          <w14:ligatures w14:val="none"/>
+        </w:rPr>
+        <w:t>Agents are placed on their home cell at initialization</w:t>
+      </w:r>
+      <w:r>
+        <w:rPr>
+          <w:rFonts w:eastAsia="Times New Roman"/>
+          <w:kern w:val="0"/>
+          <w14:ligatures w14:val="none"/>
+        </w:rPr>
+        <w:t xml:space="preserve">. </w:t>
+      </w:r>
+      <w:r>
+        <w:rPr>
+          <w:rFonts w:eastAsia="Times New Roman"/>
+          <w:kern w:val="0"/>
+          <w14:ligatures w14:val="none"/>
+        </w:rPr>
+        <w:t>Travel times are computed as:</w:t>
+      </w:r>
+    </w:p>
+    <w:p>
+      <w:pPr>
+        <w:spacing w:before="100" w:beforeAutospacing="1" w:after="100" w:afterAutospacing="1"/>
+        <w:rPr>
+          <w:rFonts w:eastAsia="Times New Roman"/>
+          <w:kern w:val="0"/>
+          <w14:ligatures w14:val="none"/>
+        </w:rPr>
+      </w:pPr>
+      <w:r>
+        <w:rPr>
+          <w:rFonts w:ascii="Courier New" w:eastAsia="Times New Roman" w:hAnsi="Courier New" w:cs="Courier New"/>
+          <w:kern w:val="0"/>
+          <w:sz w:val="20"/>
+          <w:szCs w:val="20"/>
+          <w14:ligatures w14:val="none"/>
+        </w:rPr>
+        <w:t>time_bike = path_length × bike_speed_constant</w:t>
+      </w:r>
+    </w:p>
+    <w:p>
+      <w:pPr>
+        <w:spacing w:before="100" w:beforeAutospacing="1" w:after="100" w:afterAutospacing="1"/>
+        <w:rPr>
+          <w:rFonts w:eastAsia="Times New Roman"/>
+          <w:kern w:val="0"/>
+          <w14:ligatures w14:val="none"/>
+        </w:rPr>
+      </w:pPr>
+      <w:r>
+        <w:rPr>
+          <w:rFonts w:ascii="Courier New" w:eastAsia="Times New Roman" w:hAnsi="Courier New" w:cs="Courier New"/>
+          <w:kern w:val="0"/>
+          <w:sz w:val="20"/>
+          <w:szCs w:val="20"/>
+          <w14:ligatures w14:val="none"/>
+        </w:rPr>
+        <w:lastRenderedPageBreak/>
         <w:t>time_car = path_length × car_speed_constant</w:t>
       </w:r>
     </w:p>
@@ -753,7 +853,6 @@
           <w:kern w:val="0"/>
           <w14:ligatures w14:val="none"/>
         </w:rPr>
-        <w:lastRenderedPageBreak/>
         <w:t xml:space="preserve">where </w:t>
       </w:r>
       <w:r>
@@ -1389,6 +1488,7 @@
                 <w:kern w:val="0"/>
                 <w14:ligatures w14:val="none"/>
               </w:rPr>
+              <w:lastRenderedPageBreak/>
               <w:t>Baseline</w:t>
             </w:r>
           </w:p>
@@ -1544,7 +1644,6 @@
                 <w:kern w:val="0"/>
                 <w14:ligatures w14:val="none"/>
               </w:rPr>
-              <w:lastRenderedPageBreak/>
               <w:t>Low coverage, connected</w:t>
             </w:r>
           </w:p>

</xml_diff>

<commit_message>
added stopping condition n steps
</commit_message>
<xml_diff>
--- a/Paper_Draft.docx
+++ b/Paper_Draft.docx
@@ -66,20 +66,16 @@
     </w:p>
     <w:p>
       <w:r>
-        <w:t xml:space="preserve">There has been a lot of ABM work on deciding where to place bike lanes and the cost-benefit analysis of adding lanes. What has been less explored is whether the connectivity of bike lanes impacts whether people choose to bike to and from work. Relatedly, what is the level of connectivity that results in an equilibrium where the majority of people do not change their transit preferences? The research question explored in this paper is twofold: Does the connectivity of a bike lane network have a greater effect on cycling mode share than total lane coverage, </w:t>
-      </w:r>
-      <w:commentRangeStart w:id="0"/>
-      <w:r>
-        <w:t>and at what connectivity threshold does cycling adoption become self-sustaining?</w:t>
-      </w:r>
-      <w:commentRangeEnd w:id="0"/>
-      <w:r>
-        <w:rPr>
-          <w:rStyle w:val="CommentReference"/>
-          <w:sz w:val="24"/>
-          <w:szCs w:val="24"/>
-        </w:rPr>
-        <w:commentReference w:id="0"/>
+        <w:t xml:space="preserve">There has been a lot of ABM work on deciding where to place bike lanes and the cost-benefit analysis of adding lanes. What has been less explored is whether the connectivity of bike lanes impacts whether people choose to bike to and from work. Relatedly, what is the level of connectivity that results in an equilibrium where the majority of people do not change their transit preferences? The research question explored in this paper is </w:t>
+      </w:r>
+      <w:r>
+        <w:t>as follows</w:t>
+      </w:r>
+      <w:r>
+        <w:t>: Does the connectivity of a bike lane network have a greater effect on cycling mode share than total lane coverage</w:t>
+      </w:r>
+      <w:r>
+        <w:t>?</w:t>
       </w:r>
     </w:p>
     <w:p/>
@@ -1325,45 +1321,32 @@
           <w14:ligatures w14:val="none"/>
         </w:rPr>
       </w:pPr>
-      <w:commentRangeStart w:id="1"/>
-      <w:r>
-        <w:rPr>
-          <w:rFonts w:eastAsia="Times New Roman"/>
-          <w:kern w:val="0"/>
-          <w14:ligatures w14:val="none"/>
-        </w:rPr>
-        <w:t xml:space="preserve">Finally, the agent draws a mode choice from Bernoulli(p_bike), setting </w:t>
-      </w:r>
-      <w:r>
-        <w:rPr>
-          <w:rFonts w:ascii="Courier New" w:eastAsia="Times New Roman" w:hAnsi="Courier New" w:cs="Courier New"/>
-          <w:kern w:val="0"/>
-          <w:sz w:val="20"/>
-          <w:szCs w:val="20"/>
-          <w14:ligatures w14:val="none"/>
-        </w:rPr>
-        <w:t>mode</w:t>
-      </w:r>
-      <w:r>
-        <w:rPr>
-          <w:rFonts w:eastAsia="Times New Roman"/>
-          <w:kern w:val="0"/>
-          <w14:ligatures w14:val="none"/>
-        </w:rPr>
-        <w:t xml:space="preserve"> to bike or car for that step.</w:t>
-      </w:r>
-      <w:commentRangeEnd w:id="1"/>
-      <w:r>
-        <w:rPr>
-          <w:rStyle w:val="CommentReference"/>
-          <w:rFonts w:eastAsia="Times New Roman"/>
-          <w:kern w:val="0"/>
-          <w:sz w:val="24"/>
-          <w:szCs w:val="24"/>
-          <w14:ligatures w14:val="none"/>
-        </w:rPr>
-        <w:commentReference w:id="1"/>
-      </w:r>
+      <w:r>
+        <w:rPr>
+          <w:rFonts w:eastAsia="Times New Roman"/>
+          <w:kern w:val="0"/>
+          <w14:ligatures w14:val="none"/>
+        </w:rPr>
+        <w:t xml:space="preserve">Finally, </w:t>
+      </w:r>
+      <w:r>
+        <w:rPr>
+          <w:rFonts w:eastAsia="Times New Roman"/>
+          <w:kern w:val="0"/>
+          <w14:ligatures w14:val="none"/>
+        </w:rPr>
+        <w:t xml:space="preserve">the agent’s choice to bike is deterministic if their probability of biking (p_bike) is greater than 50%. </w:t>
+      </w:r>
+    </w:p>
+    <w:p>
+      <w:pPr>
+        <w:spacing w:before="100" w:beforeAutospacing="1" w:after="100" w:afterAutospacing="1"/>
+        <w:rPr>
+          <w:rFonts w:eastAsia="Times New Roman"/>
+          <w:kern w:val="0"/>
+          <w14:ligatures w14:val="none"/>
+        </w:rPr>
+      </w:pPr>
     </w:p>
     <w:p>
       <w:pPr>
@@ -1402,6 +1385,7 @@
           <w:kern w:val="0"/>
           <w14:ligatures w14:val="none"/>
         </w:rPr>
+        <w:lastRenderedPageBreak/>
         <w:t>Five scenarios are evaluated by varying two parameters</w:t>
       </w:r>
       <w:r>
@@ -1475,7 +1459,6 @@
                 <w:kern w:val="0"/>
                 <w14:ligatures w14:val="none"/>
               </w:rPr>
-              <w:lastRenderedPageBreak/>
               <w:t>Scenario</w:t>
             </w:r>
           </w:p>
@@ -1657,7 +1640,7 @@
                 <w:kern w:val="0"/>
                 <w14:ligatures w14:val="none"/>
               </w:rPr>
-              <w:t>Low</w:t>
+              <w:t>50</w:t>
             </w:r>
           </w:p>
         </w:tc>
@@ -1735,7 +1718,7 @@
                 <w:kern w:val="0"/>
                 <w14:ligatures w14:val="none"/>
               </w:rPr>
-              <w:t>Low</w:t>
+              <w:t>50</w:t>
             </w:r>
           </w:p>
         </w:tc>
@@ -1812,7 +1795,7 @@
                 <w:kern w:val="0"/>
                 <w14:ligatures w14:val="none"/>
               </w:rPr>
-              <w:t>High</w:t>
+              <w:t>100</w:t>
             </w:r>
           </w:p>
         </w:tc>
@@ -1890,7 +1873,7 @@
                 <w:kern w:val="0"/>
                 <w14:ligatures w14:val="none"/>
               </w:rPr>
-              <w:t>High</w:t>
+              <w:t>100</w:t>
             </w:r>
           </w:p>
         </w:tc>
@@ -2009,7 +1992,7 @@
         </w:rPr>
         <w:t xml:space="preserve"> </w:t>
       </w:r>
-      <w:commentRangeStart w:id="2"/>
+      <w:commentRangeStart w:id="0"/>
       <w:r>
         <w:rPr>
           <w:rFonts w:eastAsia="Times New Roman"/>
@@ -2018,7 +2001,7 @@
         </w:rPr>
         <w:t>will be tested and reported.</w:t>
       </w:r>
-      <w:commentRangeEnd w:id="2"/>
+      <w:commentRangeEnd w:id="0"/>
       <w:r>
         <w:rPr>
           <w:rStyle w:val="CommentReference"/>
@@ -2028,7 +2011,7 @@
           <w:szCs w:val="24"/>
           <w14:ligatures w14:val="none"/>
         </w:rPr>
-        <w:commentReference w:id="2"/>
+        <w:commentReference w:id="0"/>
       </w:r>
       <w:r>
         <w:rPr>
@@ -2059,6 +2042,30 @@
         </w:rPr>
         <w:t xml:space="preserve">Results </w:t>
       </w:r>
+    </w:p>
+    <w:p>
+      <w:pPr>
+        <w:rPr>
+          <w:b/>
+          <w:bCs/>
+        </w:rPr>
+      </w:pPr>
+    </w:p>
+    <w:p>
+      <w:pPr>
+        <w:rPr>
+          <w:b/>
+          <w:bCs/>
+        </w:rPr>
+      </w:pPr>
+    </w:p>
+    <w:p>
+      <w:pPr>
+        <w:rPr>
+          <w:b/>
+          <w:bCs/>
+        </w:rPr>
+      </w:pPr>
     </w:p>
     <w:sectPr>
       <w:headerReference w:type="default" r:id="rId12"/>
@@ -2075,41 +2082,7 @@
 
 <file path=word/comments.xml><?xml version="1.0" encoding="utf-8"?>
 <w:comments xmlns:wpc="http://schemas.microsoft.com/office/word/2010/wordprocessingCanvas" xmlns:cx="http://schemas.microsoft.com/office/drawing/2014/chartex" xmlns:cx1="http://schemas.microsoft.com/office/drawing/2015/9/8/chartex" xmlns:cx2="http://schemas.microsoft.com/office/drawing/2015/10/21/chartex" xmlns:cx3="http://schemas.microsoft.com/office/drawing/2016/5/9/chartex" xmlns:cx4="http://schemas.microsoft.com/office/drawing/2016/5/10/chartex" xmlns:cx5="http://schemas.microsoft.com/office/drawing/2016/5/11/chartex" xmlns:cx6="http://schemas.microsoft.com/office/drawing/2016/5/12/chartex" xmlns:cx7="http://schemas.microsoft.com/office/drawing/2016/5/13/chartex" xmlns:cx8="http://schemas.microsoft.com/office/drawing/2016/5/14/chartex" xmlns:mc="http://schemas.openxmlformats.org/markup-compatibility/2006" xmlns:aink="http://schemas.microsoft.com/office/drawing/2016/ink" xmlns:am3d="http://schemas.microsoft.com/office/drawing/2017/model3d" xmlns:o="urn:schemas-microsoft-com:office:office" xmlns:oel="http://schemas.microsoft.com/office/2019/extlst" xmlns:r="http://schemas.openxmlformats.org/officeDocument/2006/relationships" xmlns:m="http://schemas.openxmlformats.org/officeDocument/2006/math" xmlns:v="urn:schemas-microsoft-com:vml" xmlns:wp14="http://schemas.microsoft.com/office/word/2010/wordprocessingDrawing" xmlns:wp="http://schemas.openxmlformats.org/drawingml/2006/wordprocessingDrawing" xmlns:w10="urn:schemas-microsoft-com:office:word" xmlns:w="http://schemas.openxmlformats.org/wordprocessingml/2006/main" xmlns:w14="http://schemas.microsoft.com/office/word/2010/wordml" xmlns:w15="http://schemas.microsoft.com/office/word/2012/wordml" xmlns:w16cex="http://schemas.microsoft.com/office/word/2018/wordml/cex" xmlns:w16cid="http://schemas.microsoft.com/office/word/2016/wordml/cid" xmlns:w16="http://schemas.microsoft.com/office/word/2018/wordml" xmlns:w16du="http://schemas.microsoft.com/office/word/2023/wordml/word16du" xmlns:w16sdtdh="http://schemas.microsoft.com/office/word/2020/wordml/sdtdatahash" xmlns:w16sdtfl="http://schemas.microsoft.com/office/word/2024/wordml/sdtformatlock" xmlns:w16se="http://schemas.microsoft.com/office/word/2015/wordml/symex" xmlns:wpg="http://schemas.microsoft.com/office/word/2010/wordprocessingGroup" xmlns:wpi="http://schemas.microsoft.com/office/word/2010/wordprocessingInk" xmlns:wne="http://schemas.microsoft.com/office/word/2006/wordml" xmlns:wps="http://schemas.microsoft.com/office/word/2010/wordprocessingShape" mc:Ignorable="w14 w15 w16se w16cid w16 w16cex w16sdtdh w16sdtfl w16du wp14">
-  <w:comment w:id="0" w:author="Begum Akkas" w:date="2026-05-19T11:35:00Z" w:initials="BA">
-    <w:p>
-      <w:r>
-        <w:rPr>
-          <w:rStyle w:val="CommentReference"/>
-        </w:rPr>
-        <w:annotationRef/>
-      </w:r>
-      <w:r>
-        <w:rPr>
-          <w:sz w:val="20"/>
-          <w:szCs w:val="20"/>
-        </w:rPr>
-        <w:t>remove most likely</w:t>
-      </w:r>
-    </w:p>
-  </w:comment>
-  <w:comment w:id="1" w:author="Begum Akkas" w:date="2026-05-18T16:31:00Z" w:initials="BA">
-    <w:p>
-      <w:r>
-        <w:rPr>
-          <w:rStyle w:val="CommentReference"/>
-        </w:rPr>
-        <w:annotationRef/>
-      </w:r>
-      <w:r>
-        <w:rPr>
-          <w:sz w:val="20"/>
-          <w:szCs w:val="20"/>
-        </w:rPr>
-        <w:t>changed it to be deterministic instead of probabilistic -- update this accordingly</w:t>
-      </w:r>
-    </w:p>
-  </w:comment>
-  <w:comment w:id="2" w:author="Begum Akkas" w:date="2026-05-14T19:10:00Z" w:initials="BA">
+  <w:comment w:id="0" w:author="Begum Akkas" w:date="2026-05-14T19:10:00Z" w:initials="BA">
     <w:p>
       <w:r>
         <w:rPr>
@@ -2131,24 +2104,18 @@
 
 <file path=word/commentsExtended.xml><?xml version="1.0" encoding="utf-8"?>
 <w15:commentsEx xmlns:wpc="http://schemas.microsoft.com/office/word/2010/wordprocessingCanvas" xmlns:cx="http://schemas.microsoft.com/office/drawing/2014/chartex" xmlns:cx1="http://schemas.microsoft.com/office/drawing/2015/9/8/chartex" xmlns:cx2="http://schemas.microsoft.com/office/drawing/2015/10/21/chartex" xmlns:cx3="http://schemas.microsoft.com/office/drawing/2016/5/9/chartex" xmlns:cx4="http://schemas.microsoft.com/office/drawing/2016/5/10/chartex" xmlns:cx5="http://schemas.microsoft.com/office/drawing/2016/5/11/chartex" xmlns:cx6="http://schemas.microsoft.com/office/drawing/2016/5/12/chartex" xmlns:cx7="http://schemas.microsoft.com/office/drawing/2016/5/13/chartex" xmlns:cx8="http://schemas.microsoft.com/office/drawing/2016/5/14/chartex" xmlns:mc="http://schemas.openxmlformats.org/markup-compatibility/2006" xmlns:aink="http://schemas.microsoft.com/office/drawing/2016/ink" xmlns:am3d="http://schemas.microsoft.com/office/drawing/2017/model3d" xmlns:o="urn:schemas-microsoft-com:office:office" xmlns:oel="http://schemas.microsoft.com/office/2019/extlst" xmlns:r="http://schemas.openxmlformats.org/officeDocument/2006/relationships" xmlns:m="http://schemas.openxmlformats.org/officeDocument/2006/math" xmlns:v="urn:schemas-microsoft-com:vml" xmlns:wp14="http://schemas.microsoft.com/office/word/2010/wordprocessingDrawing" xmlns:wp="http://schemas.openxmlformats.org/drawingml/2006/wordprocessingDrawing" xmlns:w10="urn:schemas-microsoft-com:office:word" xmlns:w="http://schemas.openxmlformats.org/wordprocessingml/2006/main" xmlns:w14="http://schemas.microsoft.com/office/word/2010/wordml" xmlns:w15="http://schemas.microsoft.com/office/word/2012/wordml" xmlns:w16cex="http://schemas.microsoft.com/office/word/2018/wordml/cex" xmlns:w16cid="http://schemas.microsoft.com/office/word/2016/wordml/cid" xmlns:w16="http://schemas.microsoft.com/office/word/2018/wordml" xmlns:w16du="http://schemas.microsoft.com/office/word/2023/wordml/word16du" xmlns:w16sdtdh="http://schemas.microsoft.com/office/word/2020/wordml/sdtdatahash" xmlns:w16sdtfl="http://schemas.microsoft.com/office/word/2024/wordml/sdtformatlock" xmlns:w16se="http://schemas.microsoft.com/office/word/2015/wordml/symex" xmlns:wpg="http://schemas.microsoft.com/office/word/2010/wordprocessingGroup" xmlns:wpi="http://schemas.microsoft.com/office/word/2010/wordprocessingInk" xmlns:wne="http://schemas.microsoft.com/office/word/2006/wordml" xmlns:wps="http://schemas.microsoft.com/office/word/2010/wordprocessingShape" mc:Ignorable="w14 w15 w16se w16cid w16 w16cex w16sdtdh w16sdtfl w16du wp14">
-  <w15:commentEx w15:paraId="76FADAAF" w15:done="0"/>
-  <w15:commentEx w15:paraId="49F75B3D" w15:done="0"/>
   <w15:commentEx w15:paraId="27BA0FFB" w15:done="0"/>
 </w15:commentsEx>
 </file>
 
 <file path=word/commentsExtensible.xml><?xml version="1.0" encoding="utf-8"?>
 <w16cex:commentsExtensible xmlns:wpc="http://schemas.microsoft.com/office/word/2010/wordprocessingCanvas" xmlns:cx="http://schemas.microsoft.com/office/drawing/2014/chartex" xmlns:cx1="http://schemas.microsoft.com/office/drawing/2015/9/8/chartex" xmlns:cx2="http://schemas.microsoft.com/office/drawing/2015/10/21/chartex" xmlns:cx3="http://schemas.microsoft.com/office/drawing/2016/5/9/chartex" xmlns:cx4="http://schemas.microsoft.com/office/drawing/2016/5/10/chartex" xmlns:cx5="http://schemas.microsoft.com/office/drawing/2016/5/11/chartex" xmlns:cx6="http://schemas.microsoft.com/office/drawing/2016/5/12/chartex" xmlns:cx7="http://schemas.microsoft.com/office/drawing/2016/5/13/chartex" xmlns:cx8="http://schemas.microsoft.com/office/drawing/2016/5/14/chartex" xmlns:cr="http://schemas.microsoft.com/office/comments/2020/reactions" xmlns:mc="http://schemas.openxmlformats.org/markup-compatibility/2006" xmlns:aink="http://schemas.microsoft.com/office/drawing/2016/ink" xmlns:am3d="http://schemas.microsoft.com/office/drawing/2017/model3d" xmlns:o="urn:schemas-microsoft-com:office:office" xmlns:oel="http://schemas.microsoft.com/office/2019/extlst" xmlns:r="http://schemas.openxmlformats.org/officeDocument/2006/relationships" xmlns:m="http://schemas.openxmlformats.org/officeDocument/2006/math" xmlns:v="urn:schemas-microsoft-com:vml" xmlns:wp14="http://schemas.microsoft.com/office/word/2010/wordprocessingDrawing" xmlns:wp="http://schemas.openxmlformats.org/drawingml/2006/wordprocessingDrawing" xmlns:w10="urn:schemas-microsoft-com:office:word" xmlns:w="http://schemas.openxmlformats.org/wordprocessingml/2006/main" xmlns:w14="http://schemas.microsoft.com/office/word/2010/wordml" xmlns:w15="http://schemas.microsoft.com/office/word/2012/wordml" xmlns:w16cex="http://schemas.microsoft.com/office/word/2018/wordml/cex" xmlns:w16cid="http://schemas.microsoft.com/office/word/2016/wordml/cid" xmlns:w16="http://schemas.microsoft.com/office/word/2018/wordml" xmlns:w16du="http://schemas.microsoft.com/office/word/2023/wordml/word16du" xmlns:w16sdtdh="http://schemas.microsoft.com/office/word/2020/wordml/sdtdatahash" xmlns:w16sdtfl="http://schemas.microsoft.com/office/word/2024/wordml/sdtformatlock" xmlns:w16se="http://schemas.microsoft.com/office/word/2015/wordml/symex" xmlns:wpg="http://schemas.microsoft.com/office/word/2010/wordprocessingGroup" xmlns:wpi="http://schemas.microsoft.com/office/word/2010/wordprocessingInk" xmlns:wne="http://schemas.microsoft.com/office/word/2006/wordml" xmlns:wps="http://schemas.microsoft.com/office/word/2010/wordprocessingShape" mc:Ignorable="w14 w15 w16se w16cid w16 w16cex w16sdtdh w16sdtfl cr w16du wp14">
-  <w16cex:commentExtensible w16cex:durableId="01038D8F" w16cex:dateUtc="2026-05-19T16:35:00Z"/>
-  <w16cex:commentExtensible w16cex:durableId="333294E4" w16cex:dateUtc="2026-05-18T21:31:00Z"/>
   <w16cex:commentExtensible w16cex:durableId="531C6452" w16cex:dateUtc="2026-05-15T00:10:00Z"/>
 </w16cex:commentsExtensible>
 </file>
 
 <file path=word/commentsIds.xml><?xml version="1.0" encoding="utf-8"?>
 <w16cid:commentsIds xmlns:wpc="http://schemas.microsoft.com/office/word/2010/wordprocessingCanvas" xmlns:cx="http://schemas.microsoft.com/office/drawing/2014/chartex" xmlns:cx1="http://schemas.microsoft.com/office/drawing/2015/9/8/chartex" xmlns:cx2="http://schemas.microsoft.com/office/drawing/2015/10/21/chartex" xmlns:cx3="http://schemas.microsoft.com/office/drawing/2016/5/9/chartex" xmlns:cx4="http://schemas.microsoft.com/office/drawing/2016/5/10/chartex" xmlns:cx5="http://schemas.microsoft.com/office/drawing/2016/5/11/chartex" xmlns:cx6="http://schemas.microsoft.com/office/drawing/2016/5/12/chartex" xmlns:cx7="http://schemas.microsoft.com/office/drawing/2016/5/13/chartex" xmlns:cx8="http://schemas.microsoft.com/office/drawing/2016/5/14/chartex" xmlns:mc="http://schemas.openxmlformats.org/markup-compatibility/2006" xmlns:aink="http://schemas.microsoft.com/office/drawing/2016/ink" xmlns:am3d="http://schemas.microsoft.com/office/drawing/2017/model3d" xmlns:o="urn:schemas-microsoft-com:office:office" xmlns:oel="http://schemas.microsoft.com/office/2019/extlst" xmlns:r="http://schemas.openxmlformats.org/officeDocument/2006/relationships" xmlns:m="http://schemas.openxmlformats.org/officeDocument/2006/math" xmlns:v="urn:schemas-microsoft-com:vml" xmlns:wp14="http://schemas.microsoft.com/office/word/2010/wordprocessingDrawing" xmlns:wp="http://schemas.openxmlformats.org/drawingml/2006/wordprocessingDrawing" xmlns:w10="urn:schemas-microsoft-com:office:word" xmlns:w="http://schemas.openxmlformats.org/wordprocessingml/2006/main" xmlns:w14="http://schemas.microsoft.com/office/word/2010/wordml" xmlns:w15="http://schemas.microsoft.com/office/word/2012/wordml" xmlns:w16cex="http://schemas.microsoft.com/office/word/2018/wordml/cex" xmlns:w16cid="http://schemas.microsoft.com/office/word/2016/wordml/cid" xmlns:w16="http://schemas.microsoft.com/office/word/2018/wordml" xmlns:w16du="http://schemas.microsoft.com/office/word/2023/wordml/word16du" xmlns:w16sdtdh="http://schemas.microsoft.com/office/word/2020/wordml/sdtdatahash" xmlns:w16sdtfl="http://schemas.microsoft.com/office/word/2024/wordml/sdtformatlock" xmlns:w16se="http://schemas.microsoft.com/office/word/2015/wordml/symex" xmlns:wpg="http://schemas.microsoft.com/office/word/2010/wordprocessingGroup" xmlns:wpi="http://schemas.microsoft.com/office/word/2010/wordprocessingInk" xmlns:wne="http://schemas.microsoft.com/office/word/2006/wordml" xmlns:wps="http://schemas.microsoft.com/office/word/2010/wordprocessingShape" mc:Ignorable="w14 w15 w16se w16cid w16 w16cex w16sdtdh w16sdtfl w16du wp14">
-  <w16cid:commentId w16cid:paraId="76FADAAF" w16cid:durableId="01038D8F"/>
-  <w16cid:commentId w16cid:paraId="49F75B3D" w16cid:durableId="333294E4"/>
   <w16cid:commentId w16cid:paraId="27BA0FFB" w16cid:durableId="531C6452"/>
 </w16cid:commentsIds>
 </file>

</xml_diff>